<commit_message>
feat(drafting): swap recording-promise ask-line for confirmed asks; add nova-one-pager.docx as hosted reply asset
</commit_message>
<xml_diff>
--- a/nova-one-pager.docx
+++ b/nova-one-pager.docx
@@ -29,7 +29,7 @@
           <w:sz w:val="20"/>
           <w:szCs w:val="20"/>
         </w:rPr>
-        <w:t xml:space="preserve">An AI agent for CROs — built for NoblePath and Vertex, adaptable to yours</w:t>
+        <w:t xml:space="preserve">(a lead-generation AI agent for your website, trained on your own material)</w:t>
       </w:r>
     </w:p>
     <w:p>
@@ -121,7 +121,7 @@
           <w:sz w:val="21"/>
           <w:szCs w:val="21"/>
         </w:rPr>
-        <w:t xml:space="preserve">NoblePath CRO (Türkiye) — an oncology-focused CRO. Nova has been answering sponsor questions on their site since [DATE].</w:t>
+        <w:t xml:space="preserve">NoblePath CRO (Türkiye) — an oncology-focused CRO.</w:t>
       </w:r>
     </w:p>
     <w:p>
@@ -139,7 +139,7 @@
           <w:sz w:val="21"/>
           <w:szCs w:val="21"/>
         </w:rPr>
-        <w:t xml:space="preserve">Vertex Clinical Research (Mexico) — live since [DATE].</w:t>
+        <w:t xml:space="preserve">Vertex Clinical Research (Mexico).</w:t>
       </w:r>
     </w:p>
     <w:p>
@@ -154,7 +154,7 @@
           <w:sz w:val="18"/>
           <w:szCs w:val="18"/>
         </w:rPr>
-        <w:t xml:space="preserve">[Abdullah: replace bracketed dates. If either client's Nova admin dashboard shows a real number — sponsor conversations handled, leads captured, calls booked, over a stated period — add it here as its own bullet. A specific number is the strongest line in this document. Do not estimate one.]</w:t>
+        <w:t xml:space="preserve">[Abdullah: if either client's Nova admin dashboard shows a real number — sponsor conversations handled, leads captured, calls booked, over a stated period — add it here as its own bullet. A specific number is the strongest line in this document. Do not estimate one.]</w:t>
       </w:r>
     </w:p>
     <w:p>

</xml_diff>

<commit_message>
fix(drafting): migrate stale seed wording; finalize pharma-team terminology across drafting
</commit_message>
<xml_diff>
--- a/nova-one-pager.docx
+++ b/nova-one-pager.docx
@@ -58,7 +58,7 @@
           <w:sz w:val="21"/>
           <w:szCs w:val="21"/>
         </w:rPr>
-        <w:t xml:space="preserve">A sponsor evaluating you finds your site at 11pm, has a question, and gets a contact form. By the time your team replies the next morning, they've often already moved to the next CRO on their list. That gap is where qualified leads are lost before your team ever sees them.</w:t>
+        <w:t xml:space="preserve">A pharma team evaluating you finds your site at 11pm, has a question, and gets a contact form. By the time your team replies the next morning, they've often already moved to the next CRO on their list. That gap is where qualified leads are lost before your team ever sees them.</w:t>
       </w:r>
     </w:p>
     <w:p>
@@ -87,7 +87,7 @@
           <w:sz w:val="21"/>
           <w:szCs w:val="21"/>
         </w:rPr>
-        <w:t xml:space="preserve">Nova is trained on your own SOPs, service pages, and protocols. It answers sponsor questions directly, in real time, using only your material — then qualifies the inquiry and hands your team a ready lead, at any hour.</w:t>
+        <w:t xml:space="preserve">Nova is trained on your own SOPs, service pages, and protocols. It answers pharma-team questions directly, in real time, using only your material — then qualifies the inquiry and hands your team a ready lead, at any hour.</w:t>
       </w:r>
     </w:p>
     <w:p>
@@ -140,21 +140,6 @@
           <w:szCs w:val="21"/>
         </w:rPr>
         <w:t xml:space="preserve">Vertex Clinical Research (Mexico).</w:t>
-      </w:r>
-    </w:p>
-    <w:p>
-      <w:pPr>
-        <w:spacing w:after="160"/>
-      </w:pPr>
-      <w:r>
-        <w:rPr>
-          <w:i/>
-          <w:iCs/>
-          <w:color w:val="58595B"/>
-          <w:sz w:val="18"/>
-          <w:szCs w:val="18"/>
-        </w:rPr>
-        <w:t xml:space="preserve">[Abdullah: if either client's Nova admin dashboard shows a real number — sponsor conversations handled, leads captured, calls booked, over a stated period — add it here as its own bullet. A specific number is the strongest line in this document. Do not estimate one.]</w:t>
       </w:r>
     </w:p>
     <w:p>

</xml_diff>

<commit_message>
feat(drafting): skill v3 — Sonnet 5.5 composition, verified claims, sponsor terminology, flexible length
</commit_message>
<xml_diff>
--- a/nova-one-pager.docx
+++ b/nova-one-pager.docx
@@ -58,7 +58,7 @@
           <w:sz w:val="21"/>
           <w:szCs w:val="21"/>
         </w:rPr>
-        <w:t xml:space="preserve">A pharma team evaluating you finds your site at 11pm, has a question, and gets a contact form. By the time your team replies the next morning, they've often already moved to the next CRO on their list. That gap is where qualified leads are lost before your team ever sees them.</w:t>
+        <w:t xml:space="preserve">A sponsor evaluating you finds your site at 11pm, has a question, and gets a contact form. By the time your team replies the next morning, they've often already moved to the next CRO on their list. That gap is where qualified leads are lost before your team ever sees them.</w:t>
       </w:r>
     </w:p>
     <w:p>
@@ -87,7 +87,97 @@
           <w:sz w:val="21"/>
           <w:szCs w:val="21"/>
         </w:rPr>
-        <w:t xml:space="preserve">Nova is trained on your own SOPs, service pages, and protocols. It answers pharma-team questions directly, in real time, using only your material — then qualifies the inquiry and hands your team a ready lead, at any hour.</w:t>
+        <w:t xml:space="preserve">Nova is trained on your own SOPs, service pages, and protocols. It answers sponsor questions directly, in real time, using only your material — then qualifies the inquiry and hands your team a ready lead, at any hour.</w:t>
+      </w:r>
+    </w:p>
+    <w:p>
+      <w:pPr>
+        <w:pStyle w:val="ListParagraph"/>
+        <w:numPr>
+          <w:ilvl w:val="0"/>
+          <w:numId w:val="2"/>
+        </w:numPr>
+        <w:spacing w:after="80"/>
+      </w:pPr>
+      <w:r>
+        <w:rPr>
+          <w:color w:val="1D1D1B"/>
+          <w:sz w:val="21"/>
+          <w:szCs w:val="21"/>
+        </w:rPr>
+        <w:t xml:space="preserve">Qualifies each sponsor by company, contact, therapeutic area and study phase, so your first call starts with the basics.</w:t>
+      </w:r>
+    </w:p>
+    <w:p>
+      <w:pPr>
+        <w:pStyle w:val="ListParagraph"/>
+        <w:numPr>
+          <w:ilvl w:val="0"/>
+          <w:numId w:val="2"/>
+        </w:numPr>
+        <w:spacing w:after="80"/>
+      </w:pPr>
+      <w:r>
+        <w:rPr>
+          <w:color w:val="1D1D1B"/>
+          <w:sz w:val="21"/>
+          <w:szCs w:val="21"/>
+        </w:rPr>
+        <w:t xml:space="preserve">Sends investigators, sites and course enquiries to their own flows, so BD time goes to sponsors.</w:t>
+      </w:r>
+    </w:p>
+    <w:p>
+      <w:pPr>
+        <w:pStyle w:val="ListParagraph"/>
+        <w:numPr>
+          <w:ilvl w:val="0"/>
+          <w:numId w:val="2"/>
+        </w:numPr>
+        <w:spacing w:after="80"/>
+      </w:pPr>
+      <w:r>
+        <w:rPr>
+          <w:color w:val="1D1D1B"/>
+          <w:sz w:val="21"/>
+          <w:szCs w:val="21"/>
+        </w:rPr>
+        <w:t xml:space="preserve">Emails your capabilities deck to any visitor who asks for it and leaves an email address.</w:t>
+      </w:r>
+    </w:p>
+    <w:p>
+      <w:pPr>
+        <w:pStyle w:val="ListParagraph"/>
+        <w:numPr>
+          <w:ilvl w:val="0"/>
+          <w:numId w:val="2"/>
+        </w:numPr>
+        <w:spacing w:after="80"/>
+      </w:pPr>
+      <w:r>
+        <w:rPr>
+          <w:color w:val="1D1D1B"/>
+          <w:sz w:val="21"/>
+          <w:szCs w:val="21"/>
+        </w:rPr>
+        <w:t xml:space="preserve">Offers a qualified sponsor a link to book a call with your team.</w:t>
+      </w:r>
+    </w:p>
+    <w:p>
+      <w:pPr>
+        <w:pStyle w:val="ListParagraph"/>
+        <w:numPr>
+          <w:ilvl w:val="0"/>
+          <w:numId w:val="2"/>
+        </w:numPr>
+        <w:spacing w:after="80"/>
+      </w:pPr>
+      <w:r>
+        <w:rPr>
+          <w:color w:val="1D1D1B"/>
+          <w:sz w:val="21"/>
+          <w:szCs w:val="21"/>
+        </w:rPr>
+        <w:t xml:space="preserve">Lists every captured lead, and every question it passed to your team, in a private dashboard.</w:t>
       </w:r>
     </w:p>
     <w:p>

</xml_diff>

<commit_message>
fix(drafting): narrow overclaimed capabilities; repair and compose follow-ups
</commit_message>
<xml_diff>
--- a/nova-one-pager.docx
+++ b/nova-one-pager.docx
@@ -87,7 +87,7 @@
           <w:sz w:val="21"/>
           <w:szCs w:val="21"/>
         </w:rPr>
-        <w:t xml:space="preserve">Nova is trained on your own SOPs, service pages, and protocols. It answers sponsor questions directly, in real time, using only your material — then qualifies the inquiry and hands your team a ready lead, at any hour.</w:t>
+        <w:t xml:space="preserve">Nova is trained on your own website. It answers sponsor questions directly, in real time, using only what your site says — then qualifies the inquiry and hands your team a ready lead, at any hour.</w:t>
       </w:r>
     </w:p>
     <w:p>
@@ -258,7 +258,7 @@
           <w:sz w:val="21"/>
           <w:szCs w:val="21"/>
         </w:rPr>
-        <w:t xml:space="preserve">Every CRO already has a system that works for them — a CRM, a shared sheet, an inbox someone checks by hand. Nova doesn't force a new dashboard into that. Each deployment is configured to hand qualified leads to wherever your team already works, in the shape they already expect.</w:t>
+        <w:t xml:space="preserve">Every CRO already has a system that works for them — a CRM, a shared sheet, an inbox someone checks by hand. Each deployment is configured to hand qualified leads to wherever your team already works, in the shape they already expect.</w:t>
       </w:r>
     </w:p>
     <w:p>
@@ -372,25 +372,25 @@
           <w:sz w:val="21"/>
           <w:szCs w:val="21"/>
         </w:rPr>
-        <w:t xml:space="preserve">You share your site URL and any service documentation you're comfortable sending.</w:t>
-      </w:r>
-    </w:p>
-    <w:p>
-      <w:pPr>
-        <w:pStyle w:val="ListParagraph"/>
-        <w:numPr>
-          <w:ilvl w:val="0"/>
-          <w:numId w:val="2"/>
-        </w:numPr>
-        <w:spacing w:after="80"/>
-      </w:pPr>
-      <w:r>
-        <w:rPr>
-          <w:color w:val="1D1D1B"/>
-          <w:sz w:val="21"/>
-          <w:szCs w:val="21"/>
-        </w:rPr>
-        <w:t xml:space="preserve">We configure Nova specifically on that material.</w:t>
+        <w:t xml:space="preserve">You share your site URL.</w:t>
+      </w:r>
+    </w:p>
+    <w:p>
+      <w:pPr>
+        <w:pStyle w:val="ListParagraph"/>
+        <w:numPr>
+          <w:ilvl w:val="0"/>
+          <w:numId w:val="2"/>
+        </w:numPr>
+        <w:spacing w:after="80"/>
+      </w:pPr>
+      <w:r>
+        <w:rPr>
+          <w:color w:val="1D1D1B"/>
+          <w:sz w:val="21"/>
+          <w:szCs w:val="21"/>
+        </w:rPr>
+        <w:t xml:space="preserve">We configure Nova specifically on your site content and service pages.</w:t>
       </w:r>
     </w:p>
     <w:p>

</xml_diff>